<commit_message>
Document the Profile item in the README and the 1.5.0 release notes
Co-Authored-By: Claude Sonnet 5.5 <noreply@anthropic.com>
</commit_message>
<xml_diff>
--- a/doc/mlw-xsheet-v1.5.0-Release-Notes.docx
+++ b/doc/mlw-xsheet-v1.5.0-Release-Notes.docx
@@ -593,7 +593,7 @@
               </w:rPr>
               <w:t>Copyright Notice</w:t>
               <w:tab/>
-              <w:t>6</w:t>
+              <w:t>7</w:t>
             </w:r>
           </w:hyperlink>
         </w:p>
@@ -615,7 +615,7 @@
               </w:rPr>
               <w:t>Contact Information</w:t>
               <w:tab/>
-              <w:t>8</w:t>
+              <w:t>9</w:t>
             </w:r>
           </w:hyperlink>
           <w:r>
@@ -762,6 +762,28 @@
         <w:rPr>
           <w:b/>
         </w:rPr>
+        <w:t>Profile</w:t>
+      </w:r>
+      <w:r>
+        <w:rPr/>
+        <w:t>: the user menu (the account icon) has a new Profile item that shows who is signed in: their Keycloak name, e-mail, realm, roles and client roles, and when they signed in.</w:t>
+      </w:r>
+    </w:p>
+    <w:p>
+      <w:pPr>
+        <w:pStyle w:val="ListBullet"/>
+        <w:numPr>
+          <w:ilvl w:val="0"/>
+          <w:numId w:val="1"/>
+        </w:numPr>
+        <w:spacing w:before="0" w:after="60"/>
+        <w:contextualSpacing/>
+        <w:rPr/>
+      </w:pPr>
+      <w:r>
+        <w:rPr>
+          <w:b/>
+        </w:rPr>
         <w:t>Real user names</w:t>
       </w:r>
       <w:r>
@@ -1020,6 +1042,28 @@
       <w:r>
         <w:rPr/>
         <w:t>: the admin role may change the server-wide time-out.</w:t>
+      </w:r>
+    </w:p>
+    <w:p>
+      <w:pPr>
+        <w:pStyle w:val="ListBullet"/>
+        <w:numPr>
+          <w:ilvl w:val="0"/>
+          <w:numId w:val="1"/>
+        </w:numPr>
+        <w:spacing w:before="0" w:after="60"/>
+        <w:contextualSpacing/>
+        <w:rPr/>
+      </w:pPr>
+      <w:r>
+        <w:rPr>
+          <w:b/>
+        </w:rPr>
+        <w:t>Profile</w:t>
+      </w:r>
+      <w:r>
+        <w:rPr/>
+        <w:t>: the user menu's new Profile item shows the signed-in user's Keycloak details and roles.</w:t>
       </w:r>
     </w:p>
     <w:p>
@@ -1841,6 +1885,74 @@
                 <w:szCs w:val="22"/>
                 <w:lang w:val="en-US" w:eastAsia="en-US" w:bidi="ar-SA"/>
               </w:rPr>
+              <w:t>Profile</w:t>
+            </w:r>
+          </w:p>
+        </w:tc>
+        <w:tc>
+          <w:tcPr>
+            <w:tcW w:w="7055" w:type="dxa"/>
+            <w:tcBorders/>
+          </w:tcPr>
+          <w:p>
+            <w:pPr>
+              <w:pStyle w:val="Normal"/>
+              <w:widowControl/>
+              <w:suppressAutoHyphens w:val="true"/>
+              <w:spacing w:before="0" w:after="0"/>
+              <w:jc w:val="left"/>
+              <w:rPr>
+                <w:rFonts w:cs=""/>
+                <w:kern w:val="0"/>
+                <w:szCs w:val="22"/>
+                <w:lang w:val="en-US" w:eastAsia="en-US" w:bidi="ar-SA"/>
+              </w:rPr>
+            </w:pPr>
+            <w:r>
+              <w:rPr>
+                <w:rFonts w:cs=""/>
+                <w:kern w:val="0"/>
+                <w:sz w:val="19"/>
+                <w:szCs w:val="22"/>
+                <w:lang w:val="en-US" w:eastAsia="en-US" w:bidi="ar-SA"/>
+              </w:rPr>
+              <w:t>The user menu (account icon, top right) has a Profile item above Logout. It opens a dialog with the user name, full name, e-mail (and whether it is verified), the realm and client they signed in with, their Keycloak ID, the time they signed in and whether they are an administrator, then their realm roles as badges (the administrator role highlighted) and any client roles by client. The built-in account shows its user name, that it is the built-in account, the sign-in time and the administrator role.</w:t>
+            </w:r>
+          </w:p>
+        </w:tc>
+      </w:tr>
+      <w:tr>
+        <w:trPr>
+          <w:cantSplit w:val="true"/>
+        </w:trPr>
+        <w:tc>
+          <w:tcPr>
+            <w:tcW w:w="2304" w:type="dxa"/>
+            <w:tcBorders/>
+          </w:tcPr>
+          <w:p>
+            <w:pPr>
+              <w:pStyle w:val="Normal"/>
+              <w:widowControl/>
+              <w:suppressAutoHyphens w:val="true"/>
+              <w:spacing w:before="0" w:after="0"/>
+              <w:jc w:val="left"/>
+              <w:rPr>
+                <w:rFonts w:cs=""/>
+                <w:kern w:val="0"/>
+                <w:szCs w:val="22"/>
+                <w:lang w:val="en-US" w:eastAsia="en-US" w:bidi="ar-SA"/>
+              </w:rPr>
+            </w:pPr>
+            <w:r>
+              <w:rPr>
+                <w:rFonts w:cs=""/>
+                <w:b/>
+                <w:kern w:val="0"/>
+                <w:sz w:val="19"/>
+                <w:szCs w:val="22"/>
+                <w:lang w:val="en-US" w:eastAsia="en-US" w:bidi="ar-SA"/>
+              </w:rPr>
               <w:t>Who is signed in</w:t>
             </w:r>
           </w:p>
@@ -3245,6 +3357,28 @@
       <w:r>
         <w:rPr/>
         <w:t>: preferences and drafts are kept per browser, not per Keycloak user, so two users of one browser share them.</w:t>
+      </w:r>
+    </w:p>
+    <w:p>
+      <w:pPr>
+        <w:pStyle w:val="ListBullet"/>
+        <w:numPr>
+          <w:ilvl w:val="0"/>
+          <w:numId w:val="1"/>
+        </w:numPr>
+        <w:spacing w:before="0" w:after="60"/>
+        <w:contextualSpacing/>
+        <w:rPr/>
+      </w:pPr>
+      <w:r>
+        <w:rPr>
+          <w:b/>
+        </w:rPr>
+        <w:t>Profile</w:t>
+      </w:r>
+      <w:r>
+        <w:rPr/>
+        <w:t>: it shows what Keycloak reported at login, so a change to a user's name, e-mail or roles appears only after they sign in again.</w:t>
       </w:r>
     </w:p>
     <w:p>

</xml_diff>

<commit_message>
Document the Change Password dialog in the README and the 1.5.0 release notes
Co-Authored-By: Claude Sonnet 5.5 <noreply@anthropic.com>
</commit_message>
<xml_diff>
--- a/doc/mlw-xsheet-v1.5.0-Release-Notes.docx
+++ b/doc/mlw-xsheet-v1.5.0-Release-Notes.docx
@@ -483,7 +483,7 @@
               </w:rPr>
               <w:t>3. Feature List</w:t>
               <w:tab/>
-              <w:t>4</w:t>
+              <w:t>5</w:t>
             </w:r>
           </w:hyperlink>
         </w:p>
@@ -527,7 +527,7 @@
               </w:rPr>
               <w:t>3.2 Keycloak Setup</w:t>
               <w:tab/>
-              <w:t>5</w:t>
+              <w:t>6</w:t>
             </w:r>
           </w:hyperlink>
         </w:p>
@@ -571,7 +571,7 @@
               </w:rPr>
               <w:t>4. Known Limitations</w:t>
               <w:tab/>
-              <w:t>6</w:t>
+              <w:t>7</w:t>
             </w:r>
           </w:hyperlink>
         </w:p>
@@ -762,6 +762,28 @@
         <w:rPr>
           <w:b/>
         </w:rPr>
+        <w:t>Change Password at login</w:t>
+      </w:r>
+      <w:r>
+        <w:rPr/>
+        <w:t>: when Keycloak requires a user to choose a new password (a temporary password, or the Update Password action), the login page opens a Change Password dialog. The new password is set in Keycloak and the user is logged in.</w:t>
+      </w:r>
+    </w:p>
+    <w:p>
+      <w:pPr>
+        <w:pStyle w:val="ListBullet"/>
+        <w:numPr>
+          <w:ilvl w:val="0"/>
+          <w:numId w:val="1"/>
+        </w:numPr>
+        <w:spacing w:before="0" w:after="60"/>
+        <w:contextualSpacing/>
+        <w:rPr/>
+      </w:pPr>
+      <w:r>
+        <w:rPr>
+          <w:b/>
+        </w:rPr>
         <w:t>Profile</w:t>
       </w:r>
       <w:r>
@@ -1059,6 +1081,28 @@
         <w:rPr>
           <w:b/>
         </w:rPr>
+        <w:t>Change Password dialog</w:t>
+      </w:r>
+      <w:r>
+        <w:rPr/>
+        <w:t>: a user whom Keycloak requires to change their password does so at login.</w:t>
+      </w:r>
+    </w:p>
+    <w:p>
+      <w:pPr>
+        <w:pStyle w:val="ListBullet"/>
+        <w:numPr>
+          <w:ilvl w:val="0"/>
+          <w:numId w:val="1"/>
+        </w:numPr>
+        <w:spacing w:before="0" w:after="60"/>
+        <w:contextualSpacing/>
+        <w:rPr/>
+      </w:pPr>
+      <w:r>
+        <w:rPr>
+          <w:b/>
+        </w:rPr>
         <w:t>Profile</w:t>
       </w:r>
       <w:r>
@@ -1295,7 +1339,7 @@
       </w:r>
       <w:r>
         <w:rPr/>
-        <w:t>: create the mlw-xsheet client with tools/keycloak_setup.py (or by hand: a public client with Direct access grants enabled), and give administrators the admin role.</w:t>
+        <w:t>: run tools/keycloak_setup.py to create the mlw-xsheet client (or make it by hand: a public client with Direct access grants) and the mlw-xsheet-admin client, and put the secret it prints in .env as MLW_KEYCLOAK_ADMIN_CLIENT_SECRET. Give administrators the admin role.</w:t>
       </w:r>
     </w:p>
     <w:p>
@@ -1885,6 +1929,142 @@
                 <w:szCs w:val="22"/>
                 <w:lang w:val="en-US" w:eastAsia="en-US" w:bidi="ar-SA"/>
               </w:rPr>
+              <w:t>Change Password at login</w:t>
+            </w:r>
+          </w:p>
+        </w:tc>
+        <w:tc>
+          <w:tcPr>
+            <w:tcW w:w="7055" w:type="dxa"/>
+            <w:tcBorders/>
+          </w:tcPr>
+          <w:p>
+            <w:pPr>
+              <w:pStyle w:val="Normal"/>
+              <w:widowControl/>
+              <w:suppressAutoHyphens w:val="true"/>
+              <w:spacing w:before="0" w:after="0"/>
+              <w:jc w:val="left"/>
+              <w:rPr>
+                <w:rFonts w:cs=""/>
+                <w:kern w:val="0"/>
+                <w:szCs w:val="22"/>
+                <w:lang w:val="en-US" w:eastAsia="en-US" w:bidi="ar-SA"/>
+              </w:rPr>
+            </w:pPr>
+            <w:r>
+              <w:rPr>
+                <w:rFonts w:cs=""/>
+                <w:kern w:val="0"/>
+                <w:sz w:val="19"/>
+                <w:szCs w:val="22"/>
+                <w:lang w:val="en-US" w:eastAsia="en-US" w:bidi="ar-SA"/>
+              </w:rPr>
+              <w:t>When the right password is entered for a user Keycloak requires to change theirs, a Change Password dialog opens. The user enters a new password twice (different from the current one), or cancels and stays logged out. The app re-checks the current password, sets the new one in Keycloak as a permanent password, clears the required action and logs the user in. Keycloak's password policy applies, and its refusal is shown in the dialog.</w:t>
+            </w:r>
+          </w:p>
+        </w:tc>
+      </w:tr>
+      <w:tr>
+        <w:trPr>
+          <w:cantSplit w:val="true"/>
+        </w:trPr>
+        <w:tc>
+          <w:tcPr>
+            <w:tcW w:w="2304" w:type="dxa"/>
+            <w:tcBorders/>
+          </w:tcPr>
+          <w:p>
+            <w:pPr>
+              <w:pStyle w:val="Normal"/>
+              <w:widowControl/>
+              <w:suppressAutoHyphens w:val="true"/>
+              <w:spacing w:before="0" w:after="0"/>
+              <w:jc w:val="left"/>
+              <w:rPr>
+                <w:rFonts w:cs=""/>
+                <w:kern w:val="0"/>
+                <w:szCs w:val="22"/>
+                <w:lang w:val="en-US" w:eastAsia="en-US" w:bidi="ar-SA"/>
+              </w:rPr>
+            </w:pPr>
+            <w:r>
+              <w:rPr>
+                <w:rFonts w:cs=""/>
+                <w:b/>
+                <w:kern w:val="0"/>
+                <w:sz w:val="19"/>
+                <w:szCs w:val="22"/>
+                <w:lang w:val="en-US" w:eastAsia="en-US" w:bidi="ar-SA"/>
+              </w:rPr>
+              <w:t>Who may be changed</w:t>
+            </w:r>
+          </w:p>
+        </w:tc>
+        <w:tc>
+          <w:tcPr>
+            <w:tcW w:w="7055" w:type="dxa"/>
+            <w:tcBorders/>
+          </w:tcPr>
+          <w:p>
+            <w:pPr>
+              <w:pStyle w:val="Normal"/>
+              <w:widowControl/>
+              <w:suppressAutoHyphens w:val="true"/>
+              <w:spacing w:before="0" w:after="0"/>
+              <w:jc w:val="left"/>
+              <w:rPr>
+                <w:rFonts w:cs=""/>
+                <w:kern w:val="0"/>
+                <w:szCs w:val="22"/>
+                <w:lang w:val="en-US" w:eastAsia="en-US" w:bidi="ar-SA"/>
+              </w:rPr>
+            </w:pPr>
+            <w:r>
+              <w:rPr>
+                <w:rFonts w:cs=""/>
+                <w:kern w:val="0"/>
+                <w:sz w:val="19"/>
+                <w:szCs w:val="22"/>
+                <w:lang w:val="en-US" w:eastAsia="en-US" w:bidi="ar-SA"/>
+              </w:rPr>
+              <w:t>Only a user with the Update Password action pending. The change is made through the mlw-xsheet-admin client, a confidential client whose service account can only manage users; nobody can log in with it. Without its secret the user is told to change the password in Keycloak; an account that needs something else first (such as an e-mail address) is told the same.</w:t>
+            </w:r>
+          </w:p>
+        </w:tc>
+      </w:tr>
+      <w:tr>
+        <w:trPr>
+          <w:cantSplit w:val="true"/>
+        </w:trPr>
+        <w:tc>
+          <w:tcPr>
+            <w:tcW w:w="2304" w:type="dxa"/>
+            <w:tcBorders/>
+          </w:tcPr>
+          <w:p>
+            <w:pPr>
+              <w:pStyle w:val="Normal"/>
+              <w:widowControl/>
+              <w:suppressAutoHyphens w:val="true"/>
+              <w:spacing w:before="0" w:after="0"/>
+              <w:jc w:val="left"/>
+              <w:rPr>
+                <w:rFonts w:cs=""/>
+                <w:kern w:val="0"/>
+                <w:szCs w:val="22"/>
+                <w:lang w:val="en-US" w:eastAsia="en-US" w:bidi="ar-SA"/>
+              </w:rPr>
+            </w:pPr>
+            <w:r>
+              <w:rPr>
+                <w:rFonts w:cs=""/>
+                <w:b/>
+                <w:kern w:val="0"/>
+                <w:sz w:val="19"/>
+                <w:szCs w:val="22"/>
+                <w:lang w:val="en-US" w:eastAsia="en-US" w:bidi="ar-SA"/>
+              </w:rPr>
               <w:t>Profile</w:t>
             </w:r>
           </w:p>
@@ -2408,6 +2588,74 @@
                 <w:szCs w:val="22"/>
                 <w:lang w:val="en-US" w:eastAsia="en-US" w:bidi="ar-SA"/>
               </w:rPr>
+              <w:t>Password-change client</w:t>
+            </w:r>
+          </w:p>
+        </w:tc>
+        <w:tc>
+          <w:tcPr>
+            <w:tcW w:w="7055" w:type="dxa"/>
+            <w:tcBorders/>
+          </w:tcPr>
+          <w:p>
+            <w:pPr>
+              <w:pStyle w:val="Normal"/>
+              <w:widowControl/>
+              <w:suppressAutoHyphens w:val="true"/>
+              <w:spacing w:before="0" w:after="0"/>
+              <w:jc w:val="left"/>
+              <w:rPr>
+                <w:rFonts w:cs=""/>
+                <w:kern w:val="0"/>
+                <w:szCs w:val="22"/>
+                <w:lang w:val="en-US" w:eastAsia="en-US" w:bidi="ar-SA"/>
+              </w:rPr>
+            </w:pPr>
+            <w:r>
+              <w:rPr>
+                <w:rFonts w:cs=""/>
+                <w:kern w:val="0"/>
+                <w:sz w:val="19"/>
+                <w:szCs w:val="22"/>
+                <w:lang w:val="en-US" w:eastAsia="en-US" w:bidi="ar-SA"/>
+              </w:rPr>
+              <w:t>Also creates mlw-xsheet-admin, the confidential client used for the Change Password dialog, and prints its secret. --no-admin-client skips it; --admin-client-id renames it.</w:t>
+            </w:r>
+          </w:p>
+        </w:tc>
+      </w:tr>
+      <w:tr>
+        <w:trPr>
+          <w:cantSplit w:val="true"/>
+        </w:trPr>
+        <w:tc>
+          <w:tcPr>
+            <w:tcW w:w="2304" w:type="dxa"/>
+            <w:tcBorders/>
+          </w:tcPr>
+          <w:p>
+            <w:pPr>
+              <w:pStyle w:val="Normal"/>
+              <w:widowControl/>
+              <w:suppressAutoHyphens w:val="true"/>
+              <w:spacing w:before="0" w:after="0"/>
+              <w:jc w:val="left"/>
+              <w:rPr>
+                <w:rFonts w:cs=""/>
+                <w:kern w:val="0"/>
+                <w:szCs w:val="22"/>
+                <w:lang w:val="en-US" w:eastAsia="en-US" w:bidi="ar-SA"/>
+              </w:rPr>
+            </w:pPr>
+            <w:r>
+              <w:rPr>
+                <w:rFonts w:cs=""/>
+                <w:b/>
+                <w:kern w:val="0"/>
+                <w:sz w:val="19"/>
+                <w:szCs w:val="22"/>
+                <w:lang w:val="en-US" w:eastAsia="en-US" w:bidi="ar-SA"/>
+              </w:rPr>
               <w:t>Output</w:t>
             </w:r>
           </w:p>
@@ -2439,7 +2687,7 @@
                 <w:szCs w:val="22"/>
                 <w:lang w:val="en-US" w:eastAsia="en-US" w:bidi="ar-SA"/>
               </w:rPr>
-              <w:t>The MLW_KEYCLOAK_* lines to put in .env.</w:t>
+              <w:t>The MLW_KEYCLOAK_* lines to put in .env, including MLW_KEYCLOAK_ADMIN_CLIENT_SECRET.</w:t>
             </w:r>
           </w:p>
         </w:tc>
@@ -3067,6 +3315,142 @@
                 <w:szCs w:val="22"/>
                 <w:lang w:val="en-US" w:eastAsia="en-US" w:bidi="ar-SA"/>
               </w:rPr>
+              <w:t>MLW_KEYCLOAK_ADMIN_CLIENT_ID</w:t>
+            </w:r>
+          </w:p>
+        </w:tc>
+        <w:tc>
+          <w:tcPr>
+            <w:tcW w:w="7055" w:type="dxa"/>
+            <w:tcBorders/>
+          </w:tcPr>
+          <w:p>
+            <w:pPr>
+              <w:pStyle w:val="Normal"/>
+              <w:widowControl/>
+              <w:suppressAutoHyphens w:val="true"/>
+              <w:spacing w:before="0" w:after="0"/>
+              <w:jc w:val="left"/>
+              <w:rPr>
+                <w:rFonts w:cs=""/>
+                <w:kern w:val="0"/>
+                <w:szCs w:val="22"/>
+                <w:lang w:val="en-US" w:eastAsia="en-US" w:bidi="ar-SA"/>
+              </w:rPr>
+            </w:pPr>
+            <w:r>
+              <w:rPr>
+                <w:rFonts w:cs=""/>
+                <w:kern w:val="0"/>
+                <w:sz w:val="19"/>
+                <w:szCs w:val="22"/>
+                <w:lang w:val="en-US" w:eastAsia="en-US" w:bidi="ar-SA"/>
+              </w:rPr>
+              <w:t>The client whose service account sets new passwords; default mlw-xsheet-admin.</w:t>
+            </w:r>
+          </w:p>
+        </w:tc>
+      </w:tr>
+      <w:tr>
+        <w:trPr>
+          <w:cantSplit w:val="true"/>
+        </w:trPr>
+        <w:tc>
+          <w:tcPr>
+            <w:tcW w:w="2304" w:type="dxa"/>
+            <w:tcBorders/>
+          </w:tcPr>
+          <w:p>
+            <w:pPr>
+              <w:pStyle w:val="Normal"/>
+              <w:widowControl/>
+              <w:suppressAutoHyphens w:val="true"/>
+              <w:spacing w:before="0" w:after="0"/>
+              <w:jc w:val="left"/>
+              <w:rPr>
+                <w:rFonts w:cs=""/>
+                <w:kern w:val="0"/>
+                <w:szCs w:val="22"/>
+                <w:lang w:val="en-US" w:eastAsia="en-US" w:bidi="ar-SA"/>
+              </w:rPr>
+            </w:pPr>
+            <w:r>
+              <w:rPr>
+                <w:rFonts w:cs=""/>
+                <w:b/>
+                <w:kern w:val="0"/>
+                <w:sz w:val="19"/>
+                <w:szCs w:val="22"/>
+                <w:lang w:val="en-US" w:eastAsia="en-US" w:bidi="ar-SA"/>
+              </w:rPr>
+              <w:t>MLW_KEYCLOAK_ADMIN_CLIENT_SECRET</w:t>
+            </w:r>
+          </w:p>
+        </w:tc>
+        <w:tc>
+          <w:tcPr>
+            <w:tcW w:w="7055" w:type="dxa"/>
+            <w:tcBorders/>
+          </w:tcPr>
+          <w:p>
+            <w:pPr>
+              <w:pStyle w:val="Normal"/>
+              <w:widowControl/>
+              <w:suppressAutoHyphens w:val="true"/>
+              <w:spacing w:before="0" w:after="0"/>
+              <w:jc w:val="left"/>
+              <w:rPr>
+                <w:rFonts w:cs=""/>
+                <w:kern w:val="0"/>
+                <w:szCs w:val="22"/>
+                <w:lang w:val="en-US" w:eastAsia="en-US" w:bidi="ar-SA"/>
+              </w:rPr>
+            </w:pPr>
+            <w:r>
+              <w:rPr>
+                <w:rFonts w:cs=""/>
+                <w:kern w:val="0"/>
+                <w:sz w:val="19"/>
+                <w:szCs w:val="22"/>
+                <w:lang w:val="en-US" w:eastAsia="en-US" w:bidi="ar-SA"/>
+              </w:rPr>
+              <w:t>That client's secret. Empty turns the Change Password dialog off.</w:t>
+            </w:r>
+          </w:p>
+        </w:tc>
+      </w:tr>
+      <w:tr>
+        <w:trPr>
+          <w:cantSplit w:val="true"/>
+        </w:trPr>
+        <w:tc>
+          <w:tcPr>
+            <w:tcW w:w="2304" w:type="dxa"/>
+            <w:tcBorders/>
+          </w:tcPr>
+          <w:p>
+            <w:pPr>
+              <w:pStyle w:val="Normal"/>
+              <w:widowControl/>
+              <w:suppressAutoHyphens w:val="true"/>
+              <w:spacing w:before="0" w:after="0"/>
+              <w:jc w:val="left"/>
+              <w:rPr>
+                <w:rFonts w:cs=""/>
+                <w:kern w:val="0"/>
+                <w:szCs w:val="22"/>
+                <w:lang w:val="en-US" w:eastAsia="en-US" w:bidi="ar-SA"/>
+              </w:rPr>
+            </w:pPr>
+            <w:r>
+              <w:rPr>
+                <w:rFonts w:cs=""/>
+                <w:b/>
+                <w:kern w:val="0"/>
+                <w:sz w:val="19"/>
+                <w:szCs w:val="22"/>
+                <w:lang w:val="en-US" w:eastAsia="en-US" w:bidi="ar-SA"/>
+              </w:rPr>
               <w:t>MLW_KEYCLOAK_TIMEOUT</w:t>
             </w:r>
           </w:p>
@@ -3357,6 +3741,28 @@
       <w:r>
         <w:rPr/>
         <w:t>: preferences and drafts are kept per browser, not per Keycloak user, so two users of one browser share them.</w:t>
+      </w:r>
+    </w:p>
+    <w:p>
+      <w:pPr>
+        <w:pStyle w:val="ListBullet"/>
+        <w:numPr>
+          <w:ilvl w:val="0"/>
+          <w:numId w:val="1"/>
+        </w:numPr>
+        <w:spacing w:before="0" w:after="60"/>
+        <w:contextualSpacing/>
+        <w:rPr/>
+      </w:pPr>
+      <w:r>
+        <w:rPr>
+          <w:b/>
+        </w:rPr>
+        <w:t>Password-change client</w:t>
+      </w:r>
+      <w:r>
+        <w:rPr/>
+        <w:t>: the app holds the secret of a client that may manage users, so keep .env private; it is used only for a user with the Update Password action pending. Passwords that Keycloak requires to change for another reason are not handled.</w:t>
       </w:r>
     </w:p>
     <w:p>

</xml_diff>

<commit_message>
Release notes 1.5.0: read-only XSheet Viewer and XSheet Editor roles
Co-Authored-By: Claude Sonnet 5.5 <noreply@anthropic.com>
</commit_message>
<xml_diff>
--- a/doc/mlw-xsheet-v1.5.0-Release-Notes.docx
+++ b/doc/mlw-xsheet-v1.5.0-Release-Notes.docx
@@ -373,7 +373,7 @@
               </w:rPr>
               <w:t>2. Update</w:t>
               <w:tab/>
-              <w:t>3</w:t>
+              <w:t>4</w:t>
             </w:r>
           </w:hyperlink>
         </w:p>
@@ -549,7 +549,7 @@
               </w:rPr>
               <w:t>3.3 Configuration</w:t>
               <w:tab/>
-              <w:t>6</w:t>
+              <w:t>7</w:t>
             </w:r>
           </w:hyperlink>
         </w:p>
@@ -571,7 +571,7 @@
               </w:rPr>
               <w:t>4. Known Limitations</w:t>
               <w:tab/>
-              <w:t>7</w:t>
+              <w:t>8</w:t>
             </w:r>
           </w:hyperlink>
         </w:p>
@@ -593,7 +593,7 @@
               </w:rPr>
               <w:t>Copyright Notice</w:t>
               <w:tab/>
-              <w:t>7</w:t>
+              <w:t>8</w:t>
             </w:r>
           </w:hyperlink>
         </w:p>
@@ -615,7 +615,7 @@
               </w:rPr>
               <w:t>Contact Information</w:t>
               <w:tab/>
-              <w:t>9</w:t>
+              <w:t>10</w:t>
             </w:r>
           </w:hyperlink>
           <w:r>
@@ -762,6 +762,28 @@
         <w:rPr>
           <w:b/>
         </w:rPr>
+        <w:t>Read-only access</w:t>
+      </w:r>
+      <w:r>
+        <w:rPr/>
+        <w:t>: a user whose Keycloak role is XSheet Viewer can look at documents but cannot change the XML or the Sketchpad. A user with the role XSheet Editor can do everything.</w:t>
+      </w:r>
+    </w:p>
+    <w:p>
+      <w:pPr>
+        <w:pStyle w:val="ListBullet"/>
+        <w:numPr>
+          <w:ilvl w:val="0"/>
+          <w:numId w:val="1"/>
+        </w:numPr>
+        <w:spacing w:before="0" w:after="60"/>
+        <w:contextualSpacing/>
+        <w:rPr/>
+      </w:pPr>
+      <w:r>
+        <w:rPr>
+          <w:b/>
+        </w:rPr>
         <w:t>Change Password at login</w:t>
       </w:r>
       <w:r>
@@ -1081,6 +1103,28 @@
         <w:rPr>
           <w:b/>
         </w:rPr>
+        <w:t>Read-only role</w:t>
+      </w:r>
+      <w:r>
+        <w:rPr/>
+        <w:t>: the XSheet Viewer role limits a user to read-only access; XSheet Editor allows everything.</w:t>
+      </w:r>
+    </w:p>
+    <w:p>
+      <w:pPr>
+        <w:pStyle w:val="ListBullet"/>
+        <w:numPr>
+          <w:ilvl w:val="0"/>
+          <w:numId w:val="1"/>
+        </w:numPr>
+        <w:spacing w:before="0" w:after="60"/>
+        <w:contextualSpacing/>
+        <w:rPr/>
+      </w:pPr>
+      <w:r>
+        <w:rPr>
+          <w:b/>
+        </w:rPr>
         <w:t>Change Password dialog</w:t>
       </w:r>
       <w:r>
@@ -1339,7 +1383,7 @@
       </w:r>
       <w:r>
         <w:rPr/>
-        <w:t>: run tools/keycloak_setup.py to create the mlw-xsheet client (or make it by hand: a public client with Direct access grants) and the mlw-xsheet-admin client, and put the secret it prints in .env as MLW_KEYCLOAK_ADMIN_CLIENT_SECRET. Give administrators the admin role.</w:t>
+        <w:t>: run tools/keycloak_setup.py to create the mlw-xsheet client (or make it by hand: a public client with Direct access grants) and the mlw-xsheet-admin client, and put the secret it prints in .env as MLW_KEYCLOAK_ADMIN_CLIENT_SECRET. Give administrators the admin role, and give users the XSheet Viewer (read-only) or XSheet Editor role.</w:t>
       </w:r>
     </w:p>
     <w:p>
@@ -1657,6 +1701,210 @@
                 <w:szCs w:val="22"/>
                 <w:lang w:val="en-US" w:eastAsia="en-US" w:bidi="ar-SA"/>
               </w:rPr>
+              <w:t>XSheet Viewer</w:t>
+            </w:r>
+          </w:p>
+        </w:tc>
+        <w:tc>
+          <w:tcPr>
+            <w:tcW w:w="7055" w:type="dxa"/>
+            <w:tcBorders/>
+          </w:tcPr>
+          <w:p>
+            <w:pPr>
+              <w:pStyle w:val="Normal"/>
+              <w:widowControl/>
+              <w:suppressAutoHyphens w:val="true"/>
+              <w:spacing w:before="0" w:after="0"/>
+              <w:jc w:val="left"/>
+              <w:rPr>
+                <w:rFonts w:cs=""/>
+                <w:kern w:val="0"/>
+                <w:szCs w:val="22"/>
+                <w:lang w:val="en-US" w:eastAsia="en-US" w:bidi="ar-SA"/>
+              </w:rPr>
+            </w:pPr>
+            <w:r>
+              <w:rPr>
+                <w:rFonts w:cs=""/>
+                <w:kern w:val="0"/>
+                <w:sz w:val="19"/>
+                <w:szCs w:val="22"/>
+                <w:lang w:val="en-US" w:eastAsia="en-US" w:bidi="ar-SA"/>
+              </w:rPr>
+              <w:t>Read-only access. The user can open and look at documents on every tab, use Find, list the reviews, and export or generate reports, but cannot change the XML or the Sketchpad. File &gt; New, Save and Save As, Edit &gt; Add Frame, Delete Frame, Add Layer, Delete Layer, Undo and Redo, XSheet &gt; Sketchpad and XML &gt; Format are disabled. The XML and SVG editors are read-only and the Notes cells cannot be edited; the dialogue, audio, camera, production, layer-name and review editors do not open, and Replace and Replace All in Find and Replace are refused. Every one of these is also refused on the server, with a message that the role is read-only, so nothing can be changed by other means.</w:t>
+            </w:r>
+          </w:p>
+        </w:tc>
+      </w:tr>
+      <w:tr>
+        <w:trPr>
+          <w:cantSplit w:val="true"/>
+        </w:trPr>
+        <w:tc>
+          <w:tcPr>
+            <w:tcW w:w="2304" w:type="dxa"/>
+            <w:tcBorders/>
+          </w:tcPr>
+          <w:p>
+            <w:pPr>
+              <w:pStyle w:val="Normal"/>
+              <w:widowControl/>
+              <w:suppressAutoHyphens w:val="true"/>
+              <w:spacing w:before="0" w:after="0"/>
+              <w:jc w:val="left"/>
+              <w:rPr>
+                <w:rFonts w:cs=""/>
+                <w:kern w:val="0"/>
+                <w:szCs w:val="22"/>
+                <w:lang w:val="en-US" w:eastAsia="en-US" w:bidi="ar-SA"/>
+              </w:rPr>
+            </w:pPr>
+            <w:r>
+              <w:rPr>
+                <w:rFonts w:cs=""/>
+                <w:b/>
+                <w:kern w:val="0"/>
+                <w:sz w:val="19"/>
+                <w:szCs w:val="22"/>
+                <w:lang w:val="en-US" w:eastAsia="en-US" w:bidi="ar-SA"/>
+              </w:rPr>
+              <w:t>XSheet Editor</w:t>
+            </w:r>
+          </w:p>
+        </w:tc>
+        <w:tc>
+          <w:tcPr>
+            <w:tcW w:w="7055" w:type="dxa"/>
+            <w:tcBorders/>
+          </w:tcPr>
+          <w:p>
+            <w:pPr>
+              <w:pStyle w:val="Normal"/>
+              <w:widowControl/>
+              <w:suppressAutoHyphens w:val="true"/>
+              <w:spacing w:before="0" w:after="0"/>
+              <w:jc w:val="left"/>
+              <w:rPr>
+                <w:rFonts w:cs=""/>
+                <w:kern w:val="0"/>
+                <w:szCs w:val="22"/>
+                <w:lang w:val="en-US" w:eastAsia="en-US" w:bidi="ar-SA"/>
+              </w:rPr>
+            </w:pPr>
+            <w:r>
+              <w:rPr>
+                <w:rFonts w:cs=""/>
+                <w:kern w:val="0"/>
+                <w:sz w:val="19"/>
+                <w:szCs w:val="22"/>
+                <w:lang w:val="en-US" w:eastAsia="en-US" w:bidi="ar-SA"/>
+              </w:rPr>
+              <w:t>Full access: the user can do everything. So can the administrator role, the built-in account, and a user who has neither role. A user with both Viewer and Editor (or Viewer and admin) can edit, because the higher role wins.</w:t>
+            </w:r>
+          </w:p>
+        </w:tc>
+      </w:tr>
+      <w:tr>
+        <w:trPr>
+          <w:cantSplit w:val="true"/>
+        </w:trPr>
+        <w:tc>
+          <w:tcPr>
+            <w:tcW w:w="2304" w:type="dxa"/>
+            <w:tcBorders/>
+          </w:tcPr>
+          <w:p>
+            <w:pPr>
+              <w:pStyle w:val="Normal"/>
+              <w:widowControl/>
+              <w:suppressAutoHyphens w:val="true"/>
+              <w:spacing w:before="0" w:after="0"/>
+              <w:jc w:val="left"/>
+              <w:rPr>
+                <w:rFonts w:cs=""/>
+                <w:kern w:val="0"/>
+                <w:szCs w:val="22"/>
+                <w:lang w:val="en-US" w:eastAsia="en-US" w:bidi="ar-SA"/>
+              </w:rPr>
+            </w:pPr>
+            <w:r>
+              <w:rPr>
+                <w:rFonts w:cs=""/>
+                <w:b/>
+                <w:kern w:val="0"/>
+                <w:sz w:val="19"/>
+                <w:szCs w:val="22"/>
+                <w:lang w:val="en-US" w:eastAsia="en-US" w:bidi="ar-SA"/>
+              </w:rPr>
+              <w:t>Role names</w:t>
+            </w:r>
+          </w:p>
+        </w:tc>
+        <w:tc>
+          <w:tcPr>
+            <w:tcW w:w="7055" w:type="dxa"/>
+            <w:tcBorders/>
+          </w:tcPr>
+          <w:p>
+            <w:pPr>
+              <w:pStyle w:val="Normal"/>
+              <w:widowControl/>
+              <w:suppressAutoHyphens w:val="true"/>
+              <w:spacing w:before="0" w:after="0"/>
+              <w:jc w:val="left"/>
+              <w:rPr>
+                <w:rFonts w:cs=""/>
+                <w:kern w:val="0"/>
+                <w:szCs w:val="22"/>
+                <w:lang w:val="en-US" w:eastAsia="en-US" w:bidi="ar-SA"/>
+              </w:rPr>
+            </w:pPr>
+            <w:r>
+              <w:rPr>
+                <w:rFonts w:cs=""/>
+                <w:kern w:val="0"/>
+                <w:sz w:val="19"/>
+                <w:szCs w:val="22"/>
+                <w:lang w:val="en-US" w:eastAsia="en-US" w:bidi="ar-SA"/>
+              </w:rPr>
+              <w:t>MLW_KEYCLOAK_VIEWER_ROLE (default XSheet Viewer) and MLW_KEYCLOAK_EDITOR_ROLE (default XSheet Editor) change the names. Profile shows Access: Read-only (viewer) or Can edit.</w:t>
+            </w:r>
+          </w:p>
+        </w:tc>
+      </w:tr>
+      <w:tr>
+        <w:trPr>
+          <w:cantSplit w:val="true"/>
+        </w:trPr>
+        <w:tc>
+          <w:tcPr>
+            <w:tcW w:w="2304" w:type="dxa"/>
+            <w:tcBorders/>
+          </w:tcPr>
+          <w:p>
+            <w:pPr>
+              <w:pStyle w:val="Normal"/>
+              <w:widowControl/>
+              <w:suppressAutoHyphens w:val="true"/>
+              <w:spacing w:before="0" w:after="0"/>
+              <w:jc w:val="left"/>
+              <w:rPr>
+                <w:rFonts w:cs=""/>
+                <w:kern w:val="0"/>
+                <w:szCs w:val="22"/>
+                <w:lang w:val="en-US" w:eastAsia="en-US" w:bidi="ar-SA"/>
+              </w:rPr>
+            </w:pPr>
+            <w:r>
+              <w:rPr>
+                <w:rFonts w:cs=""/>
+                <w:b/>
+                <w:kern w:val="0"/>
+                <w:sz w:val="19"/>
+                <w:szCs w:val="22"/>
+                <w:lang w:val="en-US" w:eastAsia="en-US" w:bidi="ar-SA"/>
+              </w:rPr>
               <w:t>Administrators</w:t>
             </w:r>
           </w:p>
@@ -2415,7 +2663,7 @@
                 <w:szCs w:val="22"/>
                 <w:lang w:val="en-US" w:eastAsia="en-US" w:bidi="ar-SA"/>
               </w:rPr>
-              <w:t>Creates the realm (mlw), the public client mlw-xsheet with Direct access grants, the admin realm role and, with --user, a user (--user-admin gives that user the role). Uses only the Python standard library; anything that already exists is left alone, so it can be run again.</w:t>
+              <w:t>Creates the realm (mlw), the public client mlw-xsheet with Direct access grants, the admin, XSheet Viewer and XSheet Editor realm roles and, with --user, a user (--user-admin gives that user the admin role; --user-role gives XSheet Viewer or XSheet Editor). Uses only the Python standard library; anything that already exists is left alone, so it can be run again.</w:t>
             </w:r>
           </w:p>
         </w:tc>
@@ -3247,6 +3495,142 @@
                 <w:szCs w:val="22"/>
                 <w:lang w:val="en-US" w:eastAsia="en-US" w:bidi="ar-SA"/>
               </w:rPr>
+              <w:t>MLW_KEYCLOAK_VIEWER_ROLE</w:t>
+            </w:r>
+          </w:p>
+        </w:tc>
+        <w:tc>
+          <w:tcPr>
+            <w:tcW w:w="7055" w:type="dxa"/>
+            <w:tcBorders/>
+          </w:tcPr>
+          <w:p>
+            <w:pPr>
+              <w:pStyle w:val="Normal"/>
+              <w:widowControl/>
+              <w:suppressAutoHyphens w:val="true"/>
+              <w:spacing w:before="0" w:after="0"/>
+              <w:jc w:val="left"/>
+              <w:rPr>
+                <w:rFonts w:cs=""/>
+                <w:kern w:val="0"/>
+                <w:szCs w:val="22"/>
+                <w:lang w:val="en-US" w:eastAsia="en-US" w:bidi="ar-SA"/>
+              </w:rPr>
+            </w:pPr>
+            <w:r>
+              <w:rPr>
+                <w:rFonts w:cs=""/>
+                <w:kern w:val="0"/>
+                <w:sz w:val="19"/>
+                <w:szCs w:val="22"/>
+                <w:lang w:val="en-US" w:eastAsia="en-US" w:bidi="ar-SA"/>
+              </w:rPr>
+              <w:t>The role that limits a user to read-only access; default XSheet Viewer.</w:t>
+            </w:r>
+          </w:p>
+        </w:tc>
+      </w:tr>
+      <w:tr>
+        <w:trPr>
+          <w:cantSplit w:val="true"/>
+        </w:trPr>
+        <w:tc>
+          <w:tcPr>
+            <w:tcW w:w="2304" w:type="dxa"/>
+            <w:tcBorders/>
+          </w:tcPr>
+          <w:p>
+            <w:pPr>
+              <w:pStyle w:val="Normal"/>
+              <w:widowControl/>
+              <w:suppressAutoHyphens w:val="true"/>
+              <w:spacing w:before="0" w:after="0"/>
+              <w:jc w:val="left"/>
+              <w:rPr>
+                <w:rFonts w:cs=""/>
+                <w:kern w:val="0"/>
+                <w:szCs w:val="22"/>
+                <w:lang w:val="en-US" w:eastAsia="en-US" w:bidi="ar-SA"/>
+              </w:rPr>
+            </w:pPr>
+            <w:r>
+              <w:rPr>
+                <w:rFonts w:cs=""/>
+                <w:b/>
+                <w:kern w:val="0"/>
+                <w:sz w:val="19"/>
+                <w:szCs w:val="22"/>
+                <w:lang w:val="en-US" w:eastAsia="en-US" w:bidi="ar-SA"/>
+              </w:rPr>
+              <w:t>MLW_KEYCLOAK_EDITOR_ROLE</w:t>
+            </w:r>
+          </w:p>
+        </w:tc>
+        <w:tc>
+          <w:tcPr>
+            <w:tcW w:w="7055" w:type="dxa"/>
+            <w:tcBorders/>
+          </w:tcPr>
+          <w:p>
+            <w:pPr>
+              <w:pStyle w:val="Normal"/>
+              <w:widowControl/>
+              <w:suppressAutoHyphens w:val="true"/>
+              <w:spacing w:before="0" w:after="0"/>
+              <w:jc w:val="left"/>
+              <w:rPr>
+                <w:rFonts w:cs=""/>
+                <w:kern w:val="0"/>
+                <w:szCs w:val="22"/>
+                <w:lang w:val="en-US" w:eastAsia="en-US" w:bidi="ar-SA"/>
+              </w:rPr>
+            </w:pPr>
+            <w:r>
+              <w:rPr>
+                <w:rFonts w:cs=""/>
+                <w:kern w:val="0"/>
+                <w:sz w:val="19"/>
+                <w:szCs w:val="22"/>
+                <w:lang w:val="en-US" w:eastAsia="en-US" w:bidi="ar-SA"/>
+              </w:rPr>
+              <w:t>The role that allows everything; default XSheet Editor.</w:t>
+            </w:r>
+          </w:p>
+        </w:tc>
+      </w:tr>
+      <w:tr>
+        <w:trPr>
+          <w:cantSplit w:val="true"/>
+        </w:trPr>
+        <w:tc>
+          <w:tcPr>
+            <w:tcW w:w="2304" w:type="dxa"/>
+            <w:tcBorders/>
+          </w:tcPr>
+          <w:p>
+            <w:pPr>
+              <w:pStyle w:val="Normal"/>
+              <w:widowControl/>
+              <w:suppressAutoHyphens w:val="true"/>
+              <w:spacing w:before="0" w:after="0"/>
+              <w:jc w:val="left"/>
+              <w:rPr>
+                <w:rFonts w:cs=""/>
+                <w:kern w:val="0"/>
+                <w:szCs w:val="22"/>
+                <w:lang w:val="en-US" w:eastAsia="en-US" w:bidi="ar-SA"/>
+              </w:rPr>
+            </w:pPr>
+            <w:r>
+              <w:rPr>
+                <w:rFonts w:cs=""/>
+                <w:b/>
+                <w:kern w:val="0"/>
+                <w:sz w:val="19"/>
+                <w:szCs w:val="22"/>
+                <w:lang w:val="en-US" w:eastAsia="en-US" w:bidi="ar-SA"/>
+              </w:rPr>
               <w:t>MLW_KEYCLOAK_VERIFY_TLS</w:t>
             </w:r>
           </w:p>
@@ -3806,7 +4190,29 @@
       </w:r>
       <w:r>
         <w:rPr/>
-        <w:t>: only the administrator role is used; other roles are shown but control nothing yet.</w:t>
+        <w:t>: only the administrator, XSheet Viewer and XSheet Editor roles control anything; other roles are shown but do nothing. A user with none of them can edit.</w:t>
+      </w:r>
+    </w:p>
+    <w:p>
+      <w:pPr>
+        <w:pStyle w:val="ListBullet"/>
+        <w:numPr>
+          <w:ilvl w:val="0"/>
+          <w:numId w:val="1"/>
+        </w:numPr>
+        <w:spacing w:before="0" w:after="60"/>
+        <w:contextualSpacing/>
+        <w:rPr/>
+      </w:pPr>
+      <w:r>
+        <w:rPr>
+          <w:b/>
+        </w:rPr>
+        <w:t>Read-only access</w:t>
+      </w:r>
+      <w:r>
+        <w:rPr/>
+        <w:t>: a viewer can still open files, switch tabs, use Find and export, and the XML editor cannot place a cursor or select text for them. A viewer's page keeps its role until the next login.</w:t>
       </w:r>
     </w:p>
     <w:p>

</xml_diff>

<commit_message>
Release notes 1.5.0: XSheet Reviewer role
Co-Authored-By: Claude Sonnet 5.5 <noreply@anthropic.com>
</commit_message>
<xml_diff>
--- a/doc/mlw-xsheet-v1.5.0-Release-Notes.docx
+++ b/doc/mlw-xsheet-v1.5.0-Release-Notes.docx
@@ -461,7 +461,7 @@
               </w:rPr>
               <w:t>2.4 Upgrading from 1.4.0</w:t>
               <w:tab/>
-              <w:t>4</w:t>
+              <w:t>5</w:t>
             </w:r>
           </w:hyperlink>
         </w:p>
@@ -527,7 +527,7 @@
               </w:rPr>
               <w:t>3.2 Keycloak Setup</w:t>
               <w:tab/>
-              <w:t>6</w:t>
+              <w:t>7</w:t>
             </w:r>
           </w:hyperlink>
         </w:p>
@@ -593,7 +593,7 @@
               </w:rPr>
               <w:t>Copyright Notice</w:t>
               <w:tab/>
-              <w:t>8</w:t>
+              <w:t>9</w:t>
             </w:r>
           </w:hyperlink>
         </w:p>
@@ -615,7 +615,7 @@
               </w:rPr>
               <w:t>Contact Information</w:t>
               <w:tab/>
-              <w:t>10</w:t>
+              <w:t>11</w:t>
             </w:r>
           </w:hyperlink>
           <w:r>
@@ -766,7 +766,7 @@
       </w:r>
       <w:r>
         <w:rPr/>
-        <w:t>: a user whose Keycloak role is XSheet Viewer can look at documents but cannot change the XML or the Sketchpad. A user with the role XSheet Editor can do everything.</w:t>
+        <w:t>: a user whose Keycloak role is XSheet Viewer can look at documents but cannot change the XML or the Sketchpad. XSheet Reviewer adds the ability to add reviews and use the Sketchpad. A user with the role XSheet Editor can do everything.</w:t>
       </w:r>
     </w:p>
     <w:p>
@@ -1125,6 +1125,28 @@
         <w:rPr>
           <w:b/>
         </w:rPr>
+        <w:t>Reviewer role</w:t>
+      </w:r>
+      <w:r>
+        <w:rPr/>
+        <w:t>: XSheet Reviewer is read-only plus adding reviews (and editing or deleting one's own) and using the Sketchpad.</w:t>
+      </w:r>
+    </w:p>
+    <w:p>
+      <w:pPr>
+        <w:pStyle w:val="ListBullet"/>
+        <w:numPr>
+          <w:ilvl w:val="0"/>
+          <w:numId w:val="1"/>
+        </w:numPr>
+        <w:spacing w:before="0" w:after="60"/>
+        <w:contextualSpacing/>
+        <w:rPr/>
+      </w:pPr>
+      <w:r>
+        <w:rPr>
+          <w:b/>
+        </w:rPr>
         <w:t>Change Password dialog</w:t>
       </w:r>
       <w:r>
@@ -1383,7 +1405,7 @@
       </w:r>
       <w:r>
         <w:rPr/>
-        <w:t>: run tools/keycloak_setup.py to create the mlw-xsheet client (or make it by hand: a public client with Direct access grants) and the mlw-xsheet-admin client, and put the secret it prints in .env as MLW_KEYCLOAK_ADMIN_CLIENT_SECRET. Give administrators the admin role, and give users the XSheet Viewer (read-only) or XSheet Editor role.</w:t>
+        <w:t>: run tools/keycloak_setup.py to create the mlw-xsheet client (or make it by hand: a public client with Direct access grants) and the mlw-xsheet-admin client, and put the secret it prints in .env as MLW_KEYCLOAK_ADMIN_CLIENT_SECRET. Give administrators the admin role, and give users the XSheet Viewer (read-only), XSheet Reviewer or XSheet Editor role.</w:t>
       </w:r>
     </w:p>
     <w:p>
@@ -1769,7 +1791,7 @@
                 <w:szCs w:val="22"/>
                 <w:lang w:val="en-US" w:eastAsia="en-US" w:bidi="ar-SA"/>
               </w:rPr>
-              <w:t>XSheet Editor</w:t>
+              <w:t>XSheet Reviewer</w:t>
             </w:r>
           </w:p>
         </w:tc>
@@ -1800,7 +1822,7 @@
                 <w:szCs w:val="22"/>
                 <w:lang w:val="en-US" w:eastAsia="en-US" w:bidi="ar-SA"/>
               </w:rPr>
-              <w:t>Full access: the user can do everything. So can the administrator role, the built-in account, and a user who has neither role. A user with both Viewer and Editor (or Viewer and admin) can edit, because the higher role wins.</w:t>
+              <w:t>Everything a viewer can do, plus: add reviews (About &gt; Reviews &gt; Add Review), edit or delete the reviews that name the user as their reviewer (the Reviewer field is fixed to the user's own name; other reviewers' reviews are refused), and use the Sketchpad (XSheet &gt; Sketchpad, the SVG tab's editor and Find and Replace there). Save, Save As, Undo and Redo are enabled so a reviewer can keep their reviews and sketch. Anything else that changes the XML is still refused, as for a viewer.</w:t>
             </w:r>
           </w:p>
         </w:tc>
@@ -1837,6 +1859,74 @@
                 <w:szCs w:val="22"/>
                 <w:lang w:val="en-US" w:eastAsia="en-US" w:bidi="ar-SA"/>
               </w:rPr>
+              <w:t>XSheet Editor</w:t>
+            </w:r>
+          </w:p>
+        </w:tc>
+        <w:tc>
+          <w:tcPr>
+            <w:tcW w:w="7055" w:type="dxa"/>
+            <w:tcBorders/>
+          </w:tcPr>
+          <w:p>
+            <w:pPr>
+              <w:pStyle w:val="Normal"/>
+              <w:widowControl/>
+              <w:suppressAutoHyphens w:val="true"/>
+              <w:spacing w:before="0" w:after="0"/>
+              <w:jc w:val="left"/>
+              <w:rPr>
+                <w:rFonts w:cs=""/>
+                <w:kern w:val="0"/>
+                <w:szCs w:val="22"/>
+                <w:lang w:val="en-US" w:eastAsia="en-US" w:bidi="ar-SA"/>
+              </w:rPr>
+            </w:pPr>
+            <w:r>
+              <w:rPr>
+                <w:rFonts w:cs=""/>
+                <w:kern w:val="0"/>
+                <w:sz w:val="19"/>
+                <w:szCs w:val="22"/>
+                <w:lang w:val="en-US" w:eastAsia="en-US" w:bidi="ar-SA"/>
+              </w:rPr>
+              <w:t>Full access: the user can do everything. So can the administrator role, the built-in account, and a user who has neither role. A user with several roles gets the highest: Editor or admin, then Reviewer, then Viewer.</w:t>
+            </w:r>
+          </w:p>
+        </w:tc>
+      </w:tr>
+      <w:tr>
+        <w:trPr>
+          <w:cantSplit w:val="true"/>
+        </w:trPr>
+        <w:tc>
+          <w:tcPr>
+            <w:tcW w:w="2304" w:type="dxa"/>
+            <w:tcBorders/>
+          </w:tcPr>
+          <w:p>
+            <w:pPr>
+              <w:pStyle w:val="Normal"/>
+              <w:widowControl/>
+              <w:suppressAutoHyphens w:val="true"/>
+              <w:spacing w:before="0" w:after="0"/>
+              <w:jc w:val="left"/>
+              <w:rPr>
+                <w:rFonts w:cs=""/>
+                <w:kern w:val="0"/>
+                <w:szCs w:val="22"/>
+                <w:lang w:val="en-US" w:eastAsia="en-US" w:bidi="ar-SA"/>
+              </w:rPr>
+            </w:pPr>
+            <w:r>
+              <w:rPr>
+                <w:rFonts w:cs=""/>
+                <w:b/>
+                <w:kern w:val="0"/>
+                <w:sz w:val="19"/>
+                <w:szCs w:val="22"/>
+                <w:lang w:val="en-US" w:eastAsia="en-US" w:bidi="ar-SA"/>
+              </w:rPr>
               <w:t>Role names</w:t>
             </w:r>
           </w:p>
@@ -1868,7 +1958,7 @@
                 <w:szCs w:val="22"/>
                 <w:lang w:val="en-US" w:eastAsia="en-US" w:bidi="ar-SA"/>
               </w:rPr>
-              <w:t>MLW_KEYCLOAK_VIEWER_ROLE (default XSheet Viewer) and MLW_KEYCLOAK_EDITOR_ROLE (default XSheet Editor) change the names. Profile shows Access: Read-only (viewer) or Can edit.</w:t>
+              <w:t>MLW_KEYCLOAK_VIEWER_ROLE (default XSheet Viewer), MLW_KEYCLOAK_REVIEWER_ROLE (default XSheet Reviewer) and MLW_KEYCLOAK_EDITOR_ROLE (default XSheet Editor) change the names. Profile shows Access: Read-only (viewer), Reviewer (reviews and Sketchpad) or Can edit.</w:t>
             </w:r>
           </w:p>
         </w:tc>
@@ -2663,7 +2753,7 @@
                 <w:szCs w:val="22"/>
                 <w:lang w:val="en-US" w:eastAsia="en-US" w:bidi="ar-SA"/>
               </w:rPr>
-              <w:t>Creates the realm (mlw), the public client mlw-xsheet with Direct access grants, the admin, XSheet Viewer and XSheet Editor realm roles and, with --user, a user (--user-admin gives that user the admin role; --user-role gives XSheet Viewer or XSheet Editor). Uses only the Python standard library; anything that already exists is left alone, so it can be run again.</w:t>
+              <w:t>Creates the realm (mlw), the public client mlw-xsheet with Direct access grants, the admin, XSheet Viewer, XSheet Reviewer and XSheet Editor realm roles and, with --user, a user (--user-admin gives that user the admin role; --user-role gives XSheet Viewer, XSheet Reviewer or XSheet Editor). Uses only the Python standard library; anything that already exists is left alone, so it can be run again.</w:t>
             </w:r>
           </w:p>
         </w:tc>
@@ -3563,6 +3653,74 @@
                 <w:szCs w:val="22"/>
                 <w:lang w:val="en-US" w:eastAsia="en-US" w:bidi="ar-SA"/>
               </w:rPr>
+              <w:t>MLW_KEYCLOAK_REVIEWER_ROLE</w:t>
+            </w:r>
+          </w:p>
+        </w:tc>
+        <w:tc>
+          <w:tcPr>
+            <w:tcW w:w="7055" w:type="dxa"/>
+            <w:tcBorders/>
+          </w:tcPr>
+          <w:p>
+            <w:pPr>
+              <w:pStyle w:val="Normal"/>
+              <w:widowControl/>
+              <w:suppressAutoHyphens w:val="true"/>
+              <w:spacing w:before="0" w:after="0"/>
+              <w:jc w:val="left"/>
+              <w:rPr>
+                <w:rFonts w:cs=""/>
+                <w:kern w:val="0"/>
+                <w:szCs w:val="22"/>
+                <w:lang w:val="en-US" w:eastAsia="en-US" w:bidi="ar-SA"/>
+              </w:rPr>
+            </w:pPr>
+            <w:r>
+              <w:rPr>
+                <w:rFonts w:cs=""/>
+                <w:kern w:val="0"/>
+                <w:sz w:val="19"/>
+                <w:szCs w:val="22"/>
+                <w:lang w:val="en-US" w:eastAsia="en-US" w:bidi="ar-SA"/>
+              </w:rPr>
+              <w:t>The role that is read-only like the viewer but may also add reviews and use the Sketchpad; default XSheet Reviewer.</w:t>
+            </w:r>
+          </w:p>
+        </w:tc>
+      </w:tr>
+      <w:tr>
+        <w:trPr>
+          <w:cantSplit w:val="true"/>
+        </w:trPr>
+        <w:tc>
+          <w:tcPr>
+            <w:tcW w:w="2304" w:type="dxa"/>
+            <w:tcBorders/>
+          </w:tcPr>
+          <w:p>
+            <w:pPr>
+              <w:pStyle w:val="Normal"/>
+              <w:widowControl/>
+              <w:suppressAutoHyphens w:val="true"/>
+              <w:spacing w:before="0" w:after="0"/>
+              <w:jc w:val="left"/>
+              <w:rPr>
+                <w:rFonts w:cs=""/>
+                <w:kern w:val="0"/>
+                <w:szCs w:val="22"/>
+                <w:lang w:val="en-US" w:eastAsia="en-US" w:bidi="ar-SA"/>
+              </w:rPr>
+            </w:pPr>
+            <w:r>
+              <w:rPr>
+                <w:rFonts w:cs=""/>
+                <w:b/>
+                <w:kern w:val="0"/>
+                <w:sz w:val="19"/>
+                <w:szCs w:val="22"/>
+                <w:lang w:val="en-US" w:eastAsia="en-US" w:bidi="ar-SA"/>
+              </w:rPr>
               <w:t>MLW_KEYCLOAK_EDITOR_ROLE</w:t>
             </w:r>
           </w:p>
@@ -4190,7 +4348,7 @@
       </w:r>
       <w:r>
         <w:rPr/>
-        <w:t>: only the administrator, XSheet Viewer and XSheet Editor roles control anything; other roles are shown but do nothing. A user with none of them can edit.</w:t>
+        <w:t>: only the administrator, XSheet Viewer, XSheet Reviewer and XSheet Editor roles control anything; other roles are shown but do nothing. A user with none of them can edit.</w:t>
       </w:r>
     </w:p>
     <w:p>

</xml_diff>

<commit_message>
Release notes 1.5.0: reference the User and Role Management guide
Co-Authored-By: Claude Sonnet 5.5 <noreply@anthropic.com>
</commit_message>
<xml_diff>
--- a/doc/mlw-xsheet-v1.5.0-Release-Notes.docx
+++ b/doc/mlw-xsheet-v1.5.0-Release-Notes.docx
@@ -1222,6 +1222,28 @@
     </w:p>
     <w:p>
       <w:pPr>
+        <w:pStyle w:val="ListBullet"/>
+        <w:numPr>
+          <w:ilvl w:val="0"/>
+          <w:numId w:val="1"/>
+        </w:numPr>
+        <w:spacing w:before="0" w:after="60"/>
+        <w:contextualSpacing/>
+        <w:rPr/>
+      </w:pPr>
+      <w:r>
+        <w:rPr>
+          <w:b/>
+        </w:rPr>
+        <w:t>User and Role Management guide</w:t>
+      </w:r>
+      <w:r>
+        <w:rPr/>
+        <w:t>: doc/User-Role_Management.docx describes the Keycloak integration and what each role allows.</w:t>
+      </w:r>
+    </w:p>
+    <w:p>
+      <w:pPr>
         <w:pStyle w:val="Normal"/>
         <w:rPr/>
       </w:pPr>
@@ -2435,6 +2457,74 @@
                 <w:lang w:val="en-US" w:eastAsia="en-US" w:bidi="ar-SA"/>
               </w:rPr>
               <w:t>The user menu (account icon, top right) has a Profile item above Logout. It opens a dialog with the user name, full name, e-mail (and whether it is verified), the realm and client they signed in with, their Keycloak ID, the time they signed in and whether they are an administrator, then their realm roles as badges (the administrator role highlighted) and any client roles by client. The built-in account shows its user name, that it is the built-in account, the sign-in time and the administrator role.</w:t>
+            </w:r>
+          </w:p>
+        </w:tc>
+      </w:tr>
+      <w:tr>
+        <w:trPr>
+          <w:cantSplit w:val="true"/>
+        </w:trPr>
+        <w:tc>
+          <w:tcPr>
+            <w:tcW w:w="2304" w:type="dxa"/>
+            <w:tcBorders/>
+          </w:tcPr>
+          <w:p>
+            <w:pPr>
+              <w:pStyle w:val="Normal"/>
+              <w:widowControl/>
+              <w:suppressAutoHyphens w:val="true"/>
+              <w:spacing w:before="0" w:after="0"/>
+              <w:jc w:val="left"/>
+              <w:rPr>
+                <w:rFonts w:cs=""/>
+                <w:kern w:val="0"/>
+                <w:szCs w:val="22"/>
+                <w:lang w:val="en-US" w:eastAsia="en-US" w:bidi="ar-SA"/>
+              </w:rPr>
+            </w:pPr>
+            <w:r>
+              <w:rPr>
+                <w:rFonts w:cs=""/>
+                <w:b/>
+                <w:kern w:val="0"/>
+                <w:sz w:val="19"/>
+                <w:szCs w:val="22"/>
+                <w:lang w:val="en-US" w:eastAsia="en-US" w:bidi="ar-SA"/>
+              </w:rPr>
+              <w:t>User and Role Management guide</w:t>
+            </w:r>
+          </w:p>
+        </w:tc>
+        <w:tc>
+          <w:tcPr>
+            <w:tcW w:w="7055" w:type="dxa"/>
+            <w:tcBorders/>
+          </w:tcPr>
+          <w:p>
+            <w:pPr>
+              <w:pStyle w:val="Normal"/>
+              <w:widowControl/>
+              <w:suppressAutoHyphens w:val="true"/>
+              <w:spacing w:before="0" w:after="0"/>
+              <w:jc w:val="left"/>
+              <w:rPr>
+                <w:rFonts w:cs=""/>
+                <w:kern w:val="0"/>
+                <w:szCs w:val="22"/>
+                <w:lang w:val="en-US" w:eastAsia="en-US" w:bidi="ar-SA"/>
+              </w:rPr>
+            </w:pPr>
+            <w:r>
+              <w:rPr>
+                <w:rFonts w:cs=""/>
+                <w:kern w:val="0"/>
+                <w:sz w:val="19"/>
+                <w:szCs w:val="22"/>
+                <w:lang w:val="en-US" w:eastAsia="en-US" w:bidi="ar-SA"/>
+              </w:rPr>
+              <w:t>doc/User-Role_Management.docx is a Word document for the people who run the server. It explains how sign-in works, how to set Keycloak up and manage users, a table of what each role can do, examples and troubleshooting.</w:t>
             </w:r>
           </w:p>
         </w:tc>

</xml_diff>

<commit_message>
Release notes 1.5.0: Sketchpad multi-select
Co-Authored-By: Claude Sonnet 5.5 <noreply@anthropic.com>
</commit_message>
<xml_diff>
--- a/doc/mlw-xsheet-v1.5.0-Release-Notes.docx
+++ b/doc/mlw-xsheet-v1.5.0-Release-Notes.docx
@@ -555,6 +555,28 @@
         </w:p>
         <w:p>
           <w:pPr>
+            <w:pStyle w:val="TOC2"/>
+            <w:tabs>
+              <w:tab w:val="clear" w:pos="9077"/>
+              <w:tab w:val="right" w:pos="9359" w:leader="dot"/>
+            </w:tabs>
+            <w:rPr/>
+          </w:pPr>
+          <w:hyperlink w:anchor="__RefHeading___Toc9012_150">
+            <w:r>
+              <w:rPr>
+                <w:webHidden/>
+                <w:rStyle w:val="IndexLink"/>
+                <w:vanish w:val="false"/>
+              </w:rPr>
+              <w:t>3.4 Sketchpad: Selecting Several Shapes</w:t>
+              <w:tab/>
+              <w:t>8</w:t>
+            </w:r>
+          </w:hyperlink>
+        </w:p>
+        <w:p>
+          <w:pPr>
             <w:pStyle w:val="TOC1"/>
             <w:tabs>
               <w:tab w:val="clear" w:pos="9360"/>
@@ -562,7 +584,7 @@
             </w:tabs>
             <w:rPr/>
           </w:pPr>
-          <w:hyperlink w:anchor="__RefHeading___Toc9012_150">
+          <w:hyperlink w:anchor="__RefHeading___Toc9013_150">
             <w:r>
               <w:rPr>
                 <w:webHidden/>
@@ -571,7 +593,7 @@
               </w:rPr>
               <w:t>4. Known Limitations</w:t>
               <w:tab/>
-              <w:t>8</w:t>
+              <w:t>9</w:t>
             </w:r>
           </w:hyperlink>
         </w:p>
@@ -1174,6 +1196,28 @@
       <w:r>
         <w:rPr/>
         <w:t>: the user menu's new Profile item shows the signed-in user's Keycloak details and roles.</w:t>
+      </w:r>
+    </w:p>
+    <w:p>
+      <w:pPr>
+        <w:pStyle w:val="ListBullet"/>
+        <w:numPr>
+          <w:ilvl w:val="0"/>
+          <w:numId w:val="1"/>
+        </w:numPr>
+        <w:spacing w:before="0" w:after="60"/>
+        <w:contextualSpacing/>
+        <w:rPr/>
+      </w:pPr>
+      <w:r>
+        <w:rPr>
+          <w:b/>
+        </w:rPr>
+        <w:t>Sketchpad multi-select</w:t>
+      </w:r>
+      <w:r>
+        <w:rPr/>
+        <w:t>: in the Sketchpad's Select tool, drag a rectangle across several shapes to select them, and move, delete or recolour them together.</w:t>
       </w:r>
     </w:p>
     <w:p>
@@ -4268,14 +4312,547 @@
     </w:p>
     <w:p>
       <w:pPr>
+        <w:pStyle w:val="Heading2"/>
+        <w:rPr/>
+      </w:pPr>
+      <w:bookmarkStart w:id="9013" w:name="__RefHeading___Toc9012_150"/>
+      <w:r>
+        <w:rPr/>
+        <w:t>3.4 Sketchpad: Selecting Several Shapes</w:t>
+      </w:r>
+      <w:bookmarkEnd w:id="9013"/>
+    </w:p>
+    <w:p>
+      <w:pPr>
+        <w:pStyle w:val="Normal"/>
+        <w:rPr/>
+      </w:pPr>
+      <w:r>
+        <w:rPr/>
+        <w:t>In the Sketchpad's Select tool, several shapes can be selected at once and handled as a group.</w:t>
+      </w:r>
+    </w:p>
+    <w:tbl>
+      <w:tblPr>
+        <w:tblStyle w:val="TableGrid"/>
+        <w:tblW w:w="9360" w:type="dxa"/>
+        <w:jc w:val="center"/>
+        <w:tblInd w:w="0" w:type="dxa"/>
+        <w:tblLayout w:type="fixed"/>
+        <w:tblCellMar>
+          <w:top w:w="0" w:type="dxa"/>
+          <w:left w:w="108" w:type="dxa"/>
+          <w:bottom w:w="0" w:type="dxa"/>
+          <w:right w:w="108" w:type="dxa"/>
+        </w:tblCellMar>
+        <w:tblLook w:val="04a0" w:noHBand="0" w:noVBand="1" w:firstColumn="1" w:lastRow="0" w:lastColumn="0" w:firstRow="1"/>
+      </w:tblPr>
+      <w:tblGrid>
+        <w:gridCol w:w="2304"/>
+        <w:gridCol w:w="7055"/>
+      </w:tblGrid>
+      <w:tr>
+        <w:trPr>
+          <w:tblHeader w:val="true"/>
+        </w:trPr>
+        <w:tc>
+          <w:tcPr>
+            <w:tcW w:w="2304" w:type="dxa"/>
+            <w:tcBorders/>
+            <w:shd w:color="auto" w:fill="5898D4" w:val="clear"/>
+          </w:tcPr>
+          <w:p>
+            <w:pPr>
+              <w:pStyle w:val="Normal"/>
+              <w:widowControl/>
+              <w:suppressAutoHyphens w:val="true"/>
+              <w:spacing w:before="0" w:after="120"/>
+              <w:jc w:val="left"/>
+              <w:rPr>
+                <w:rFonts w:cs=""/>
+                <w:kern w:val="0"/>
+                <w:szCs w:val="22"/>
+                <w:lang w:val="en-US" w:eastAsia="en-US" w:bidi="ar-SA"/>
+              </w:rPr>
+            </w:pPr>
+            <w:r>
+              <w:rPr>
+                <w:rFonts w:cs=""/>
+                <w:b/>
+                <w:color w:val="FFFFFF"/>
+                <w:kern w:val="0"/>
+                <w:sz w:val="19"/>
+                <w:szCs w:val="22"/>
+                <w:lang w:val="en-US" w:eastAsia="en-US" w:bidi="ar-SA"/>
+              </w:rPr>
+              <w:t>Feature</w:t>
+            </w:r>
+          </w:p>
+        </w:tc>
+        <w:tc>
+          <w:tcPr>
+            <w:tcW w:w="7055" w:type="dxa"/>
+            <w:tcBorders/>
+            <w:shd w:color="auto" w:fill="5898D4" w:val="clear"/>
+          </w:tcPr>
+          <w:p>
+            <w:pPr>
+              <w:pStyle w:val="Normal"/>
+              <w:widowControl/>
+              <w:suppressAutoHyphens w:val="true"/>
+              <w:spacing w:before="0" w:after="120"/>
+              <w:jc w:val="left"/>
+              <w:rPr>
+                <w:rFonts w:cs=""/>
+                <w:kern w:val="0"/>
+                <w:szCs w:val="22"/>
+                <w:lang w:val="en-US" w:eastAsia="en-US" w:bidi="ar-SA"/>
+              </w:rPr>
+            </w:pPr>
+            <w:r>
+              <w:rPr>
+                <w:rFonts w:cs=""/>
+                <w:b/>
+                <w:color w:val="FFFFFF"/>
+                <w:kern w:val="0"/>
+                <w:sz w:val="19"/>
+                <w:szCs w:val="22"/>
+                <w:lang w:val="en-US" w:eastAsia="en-US" w:bidi="ar-SA"/>
+              </w:rPr>
+              <w:t>Capability</w:t>
+            </w:r>
+          </w:p>
+        </w:tc>
+      </w:tr>
+      <w:tr>
+        <w:trPr>
+          <w:cantSplit w:val="true"/>
+        </w:trPr>
+        <w:tc>
+          <w:tcPr>
+            <w:tcW w:w="2304" w:type="dxa"/>
+            <w:tcBorders/>
+          </w:tcPr>
+          <w:p>
+            <w:pPr>
+              <w:pStyle w:val="Normal"/>
+              <w:widowControl/>
+              <w:suppressAutoHyphens w:val="true"/>
+              <w:spacing w:before="0" w:after="0"/>
+              <w:jc w:val="left"/>
+              <w:rPr>
+                <w:rFonts w:cs=""/>
+                <w:kern w:val="0"/>
+                <w:szCs w:val="22"/>
+                <w:lang w:val="en-US" w:eastAsia="en-US" w:bidi="ar-SA"/>
+              </w:rPr>
+            </w:pPr>
+            <w:r>
+              <w:rPr>
+                <w:rFonts w:cs=""/>
+                <w:b/>
+                <w:kern w:val="0"/>
+                <w:sz w:val="19"/>
+                <w:szCs w:val="22"/>
+                <w:lang w:val="en-US" w:eastAsia="en-US" w:bidi="ar-SA"/>
+              </w:rPr>
+              <w:t>Select by dragging</w:t>
+            </w:r>
+          </w:p>
+        </w:tc>
+        <w:tc>
+          <w:tcPr>
+            <w:tcW w:w="7055" w:type="dxa"/>
+            <w:tcBorders/>
+          </w:tcPr>
+          <w:p>
+            <w:pPr>
+              <w:pStyle w:val="Normal"/>
+              <w:widowControl/>
+              <w:suppressAutoHyphens w:val="true"/>
+              <w:spacing w:before="0" w:after="0"/>
+              <w:jc w:val="left"/>
+              <w:rPr>
+                <w:rFonts w:cs=""/>
+                <w:kern w:val="0"/>
+                <w:szCs w:val="22"/>
+                <w:lang w:val="en-US" w:eastAsia="en-US" w:bidi="ar-SA"/>
+              </w:rPr>
+            </w:pPr>
+            <w:r>
+              <w:rPr>
+                <w:rFonts w:cs=""/>
+                <w:kern w:val="0"/>
+                <w:sz w:val="19"/>
+                <w:szCs w:val="22"/>
+                <w:lang w:val="en-US" w:eastAsia="en-US" w:bidi="ar-SA"/>
+              </w:rPr>
+              <w:t>Press on empty space and drag a rectangle across the shapes. Every shape the rectangle crosses (any part of its line, or a text string's box) is selected and highlighted, without handles. A rectangle that crosses one shape selects just that shape, with its handles as before; one that crosses none selects nothing.</w:t>
+            </w:r>
+          </w:p>
+        </w:tc>
+      </w:tr>
+      <w:tr>
+        <w:trPr>
+          <w:cantSplit w:val="true"/>
+        </w:trPr>
+        <w:tc>
+          <w:tcPr>
+            <w:tcW w:w="2304" w:type="dxa"/>
+            <w:tcBorders/>
+          </w:tcPr>
+          <w:p>
+            <w:pPr>
+              <w:pStyle w:val="Normal"/>
+              <w:widowControl/>
+              <w:suppressAutoHyphens w:val="true"/>
+              <w:spacing w:before="0" w:after="0"/>
+              <w:jc w:val="left"/>
+              <w:rPr>
+                <w:rFonts w:cs=""/>
+                <w:kern w:val="0"/>
+                <w:szCs w:val="22"/>
+                <w:lang w:val="en-US" w:eastAsia="en-US" w:bidi="ar-SA"/>
+              </w:rPr>
+            </w:pPr>
+            <w:r>
+              <w:rPr>
+                <w:rFonts w:cs=""/>
+                <w:b/>
+                <w:kern w:val="0"/>
+                <w:sz w:val="19"/>
+                <w:szCs w:val="22"/>
+                <w:lang w:val="en-US" w:eastAsia="en-US" w:bidi="ar-SA"/>
+              </w:rPr>
+              <w:t>Shift+click</w:t>
+            </w:r>
+          </w:p>
+        </w:tc>
+        <w:tc>
+          <w:tcPr>
+            <w:tcW w:w="7055" w:type="dxa"/>
+            <w:tcBorders/>
+          </w:tcPr>
+          <w:p>
+            <w:pPr>
+              <w:pStyle w:val="Normal"/>
+              <w:widowControl/>
+              <w:suppressAutoHyphens w:val="true"/>
+              <w:spacing w:before="0" w:after="0"/>
+              <w:jc w:val="left"/>
+              <w:rPr>
+                <w:rFonts w:cs=""/>
+                <w:kern w:val="0"/>
+                <w:szCs w:val="22"/>
+                <w:lang w:val="en-US" w:eastAsia="en-US" w:bidi="ar-SA"/>
+              </w:rPr>
+            </w:pPr>
+            <w:r>
+              <w:rPr>
+                <w:rFonts w:cs=""/>
+                <w:kern w:val="0"/>
+                <w:sz w:val="19"/>
+                <w:szCs w:val="22"/>
+                <w:lang w:val="en-US" w:eastAsia="en-US" w:bidi="ar-SA"/>
+              </w:rPr>
+              <w:t>Adds a shape to the selection, or takes it out. Shift with the rectangle adds to the current selection.</w:t>
+            </w:r>
+          </w:p>
+        </w:tc>
+      </w:tr>
+      <w:tr>
+        <w:trPr>
+          <w:cantSplit w:val="true"/>
+        </w:trPr>
+        <w:tc>
+          <w:tcPr>
+            <w:tcW w:w="2304" w:type="dxa"/>
+            <w:tcBorders/>
+          </w:tcPr>
+          <w:p>
+            <w:pPr>
+              <w:pStyle w:val="Normal"/>
+              <w:widowControl/>
+              <w:suppressAutoHyphens w:val="true"/>
+              <w:spacing w:before="0" w:after="0"/>
+              <w:jc w:val="left"/>
+              <w:rPr>
+                <w:rFonts w:cs=""/>
+                <w:kern w:val="0"/>
+                <w:szCs w:val="22"/>
+                <w:lang w:val="en-US" w:eastAsia="en-US" w:bidi="ar-SA"/>
+              </w:rPr>
+            </w:pPr>
+            <w:r>
+              <w:rPr>
+                <w:rFonts w:cs=""/>
+                <w:b/>
+                <w:kern w:val="0"/>
+                <w:sz w:val="19"/>
+                <w:szCs w:val="22"/>
+                <w:lang w:val="en-US" w:eastAsia="en-US" w:bidi="ar-SA"/>
+              </w:rPr>
+              <w:t>Move together</w:t>
+            </w:r>
+          </w:p>
+        </w:tc>
+        <w:tc>
+          <w:tcPr>
+            <w:tcW w:w="7055" w:type="dxa"/>
+            <w:tcBorders/>
+          </w:tcPr>
+          <w:p>
+            <w:pPr>
+              <w:pStyle w:val="Normal"/>
+              <w:widowControl/>
+              <w:suppressAutoHyphens w:val="true"/>
+              <w:spacing w:before="0" w:after="0"/>
+              <w:jc w:val="left"/>
+              <w:rPr>
+                <w:rFonts w:cs=""/>
+                <w:kern w:val="0"/>
+                <w:szCs w:val="22"/>
+                <w:lang w:val="en-US" w:eastAsia="en-US" w:bidi="ar-SA"/>
+              </w:rPr>
+            </w:pPr>
+            <w:r>
+              <w:rPr>
+                <w:rFonts w:cs=""/>
+                <w:kern w:val="0"/>
+                <w:sz w:val="19"/>
+                <w:szCs w:val="22"/>
+                <w:lang w:val="en-US" w:eastAsia="en-US" w:bidi="ar-SA"/>
+              </w:rPr>
+              <w:t>Dragging any selected shape moves all of them, keeping their positions relative to each other. The move is one Undo step.</w:t>
+            </w:r>
+          </w:p>
+        </w:tc>
+      </w:tr>
+      <w:tr>
+        <w:trPr>
+          <w:cantSplit w:val="true"/>
+        </w:trPr>
+        <w:tc>
+          <w:tcPr>
+            <w:tcW w:w="2304" w:type="dxa"/>
+            <w:tcBorders/>
+          </w:tcPr>
+          <w:p>
+            <w:pPr>
+              <w:pStyle w:val="Normal"/>
+              <w:widowControl/>
+              <w:suppressAutoHyphens w:val="true"/>
+              <w:spacing w:before="0" w:after="0"/>
+              <w:jc w:val="left"/>
+              <w:rPr>
+                <w:rFonts w:cs=""/>
+                <w:kern w:val="0"/>
+                <w:szCs w:val="22"/>
+                <w:lang w:val="en-US" w:eastAsia="en-US" w:bidi="ar-SA"/>
+              </w:rPr>
+            </w:pPr>
+            <w:r>
+              <w:rPr>
+                <w:rFonts w:cs=""/>
+                <w:b/>
+                <w:kern w:val="0"/>
+                <w:sz w:val="19"/>
+                <w:szCs w:val="22"/>
+                <w:lang w:val="en-US" w:eastAsia="en-US" w:bidi="ar-SA"/>
+              </w:rPr>
+              <w:t>Delete</w:t>
+            </w:r>
+          </w:p>
+        </w:tc>
+        <w:tc>
+          <w:tcPr>
+            <w:tcW w:w="7055" w:type="dxa"/>
+            <w:tcBorders/>
+          </w:tcPr>
+          <w:p>
+            <w:pPr>
+              <w:pStyle w:val="Normal"/>
+              <w:widowControl/>
+              <w:suppressAutoHyphens w:val="true"/>
+              <w:spacing w:before="0" w:after="0"/>
+              <w:jc w:val="left"/>
+              <w:rPr>
+                <w:rFonts w:cs=""/>
+                <w:kern w:val="0"/>
+                <w:szCs w:val="22"/>
+                <w:lang w:val="en-US" w:eastAsia="en-US" w:bidi="ar-SA"/>
+              </w:rPr>
+            </w:pPr>
+            <w:r>
+              <w:rPr>
+                <w:rFonts w:cs=""/>
+                <w:kern w:val="0"/>
+                <w:sz w:val="19"/>
+                <w:szCs w:val="22"/>
+                <w:lang w:val="en-US" w:eastAsia="en-US" w:bidi="ar-SA"/>
+              </w:rPr>
+              <w:t>The Delete key, or the trash button, removes all the selected shapes, as one Undo step.</w:t>
+            </w:r>
+          </w:p>
+        </w:tc>
+      </w:tr>
+      <w:tr>
+        <w:trPr>
+          <w:cantSplit w:val="true"/>
+        </w:trPr>
+        <w:tc>
+          <w:tcPr>
+            <w:tcW w:w="2304" w:type="dxa"/>
+            <w:tcBorders/>
+          </w:tcPr>
+          <w:p>
+            <w:pPr>
+              <w:pStyle w:val="Normal"/>
+              <w:widowControl/>
+              <w:suppressAutoHyphens w:val="true"/>
+              <w:spacing w:before="0" w:after="0"/>
+              <w:jc w:val="left"/>
+              <w:rPr>
+                <w:rFonts w:cs=""/>
+                <w:kern w:val="0"/>
+                <w:szCs w:val="22"/>
+                <w:lang w:val="en-US" w:eastAsia="en-US" w:bidi="ar-SA"/>
+              </w:rPr>
+            </w:pPr>
+            <w:r>
+              <w:rPr>
+                <w:rFonts w:cs=""/>
+                <w:b/>
+                <w:kern w:val="0"/>
+                <w:sz w:val="19"/>
+                <w:szCs w:val="22"/>
+                <w:lang w:val="en-US" w:eastAsia="en-US" w:bidi="ar-SA"/>
+              </w:rPr>
+              <w:t>Colour and brush</w:t>
+            </w:r>
+          </w:p>
+        </w:tc>
+        <w:tc>
+          <w:tcPr>
+            <w:tcW w:w="7055" w:type="dxa"/>
+            <w:tcBorders/>
+          </w:tcPr>
+          <w:p>
+            <w:pPr>
+              <w:pStyle w:val="Normal"/>
+              <w:widowControl/>
+              <w:suppressAutoHyphens w:val="true"/>
+              <w:spacing w:before="0" w:after="0"/>
+              <w:jc w:val="left"/>
+              <w:rPr>
+                <w:rFonts w:cs=""/>
+                <w:kern w:val="0"/>
+                <w:szCs w:val="22"/>
+                <w:lang w:val="en-US" w:eastAsia="en-US" w:bidi="ar-SA"/>
+              </w:rPr>
+            </w:pPr>
+            <w:r>
+              <w:rPr>
+                <w:rFonts w:cs=""/>
+                <w:kern w:val="0"/>
+                <w:sz w:val="19"/>
+                <w:szCs w:val="22"/>
+                <w:lang w:val="en-US" w:eastAsia="en-US" w:bidi="ar-SA"/>
+              </w:rPr>
+              <w:t>Choosing a colour or brush size changes every selected shape (the brush size does not change text), as one Undo step.</w:t>
+            </w:r>
+          </w:p>
+        </w:tc>
+      </w:tr>
+      <w:tr>
+        <w:trPr>
+          <w:cantSplit w:val="true"/>
+        </w:trPr>
+        <w:tc>
+          <w:tcPr>
+            <w:tcW w:w="2304" w:type="dxa"/>
+            <w:tcBorders/>
+          </w:tcPr>
+          <w:p>
+            <w:pPr>
+              <w:pStyle w:val="Normal"/>
+              <w:widowControl/>
+              <w:suppressAutoHyphens w:val="true"/>
+              <w:spacing w:before="0" w:after="0"/>
+              <w:jc w:val="left"/>
+              <w:rPr>
+                <w:rFonts w:cs=""/>
+                <w:kern w:val="0"/>
+                <w:szCs w:val="22"/>
+                <w:lang w:val="en-US" w:eastAsia="en-US" w:bidi="ar-SA"/>
+              </w:rPr>
+            </w:pPr>
+            <w:r>
+              <w:rPr>
+                <w:rFonts w:cs=""/>
+                <w:b/>
+                <w:kern w:val="0"/>
+                <w:sz w:val="19"/>
+                <w:szCs w:val="22"/>
+                <w:lang w:val="en-US" w:eastAsia="en-US" w:bidi="ar-SA"/>
+              </w:rPr>
+              <w:t>Deselecting</w:t>
+            </w:r>
+          </w:p>
+        </w:tc>
+        <w:tc>
+          <w:tcPr>
+            <w:tcW w:w="7055" w:type="dxa"/>
+            <w:tcBorders/>
+          </w:tcPr>
+          <w:p>
+            <w:pPr>
+              <w:pStyle w:val="Normal"/>
+              <w:widowControl/>
+              <w:suppressAutoHyphens w:val="true"/>
+              <w:spacing w:before="0" w:after="0"/>
+              <w:jc w:val="left"/>
+              <w:rPr>
+                <w:rFonts w:cs=""/>
+                <w:kern w:val="0"/>
+                <w:szCs w:val="22"/>
+                <w:lang w:val="en-US" w:eastAsia="en-US" w:bidi="ar-SA"/>
+              </w:rPr>
+            </w:pPr>
+            <w:r>
+              <w:rPr>
+                <w:rFonts w:cs=""/>
+                <w:kern w:val="0"/>
+                <w:sz w:val="19"/>
+                <w:szCs w:val="22"/>
+                <w:lang w:val="en-US" w:eastAsia="en-US" w:bidi="ar-SA"/>
+              </w:rPr>
+              <w:t>Click empty space. Undo and Redo, choosing a drawing shape, and turning the Sketchpad off also clear the selection.</w:t>
+            </w:r>
+          </w:p>
+        </w:tc>
+      </w:tr>
+    </w:tbl>
+    <w:p>
+      <w:pPr>
+        <w:pStyle w:val="Normal"/>
+        <w:spacing w:before="0" w:after="40"/>
+        <w:rPr/>
+      </w:pPr>
+      <w:r>
+        <w:rPr/>
+      </w:r>
+    </w:p>
+    <w:p>
+      <w:pPr>
         <w:pStyle w:val="Heading1"/>
         <w:rPr/>
       </w:pPr>
-      <w:bookmarkStart w:id="9013" w:name="__RefHeading___Toc9012_150"/>
+      <w:bookmarkStart w:id="9014" w:name="__RefHeading___Toc9013_150"/>
       <w:r>
         <w:t>4. Known Limitations</w:t>
       </w:r>
-      <w:bookmarkEnd w:id="9013"/>
+      <w:bookmarkEnd w:id="9014"/>
     </w:p>
     <w:p>
       <w:pPr>
@@ -4491,12 +5068,12 @@
         <w:spacing w:before="0" w:after="120"/>
         <w:rPr/>
       </w:pPr>
-      <w:bookmarkStart w:id="9014" w:name="__RefHeading___Toc9990_150"/>
+      <w:bookmarkStart w:id="9015" w:name="__RefHeading___Toc9990_150"/>
       <w:r>
         <w:rPr/>
         <w:t>Copyright Notice</w:t>
       </w:r>
-      <w:bookmarkEnd w:id="9014"/>
+      <w:bookmarkEnd w:id="9015"/>
     </w:p>
     <w:p>
       <w:pPr>
@@ -7287,12 +7864,12 @@
         <w:pStyle w:val="Heading1"/>
         <w:rPr/>
       </w:pPr>
-      <w:bookmarkStart w:id="9015" w:name="__RefHeading___Toc9991_150"/>
+      <w:bookmarkStart w:id="9016" w:name="__RefHeading___Toc9991_150"/>
       <w:r>
         <w:rPr/>
         <w:t>Contact Information</w:t>
       </w:r>
-      <w:bookmarkEnd w:id="9015"/>
+      <w:bookmarkEnd w:id="9016"/>
     </w:p>
     <w:p>
       <w:pPr>

</xml_diff>